<commit_message>
Update Data Mover screenshot guide
</commit_message>
<xml_diff>
--- a/artifacts/Data_Mover_Demo_Screenshots_v1.docx
+++ b/artifacts/Data_Mover_Demo_Screenshots_v1.docx
@@ -127,16 +127,6 @@
             <w:r>
               <w:rPr>
                 <w:rFonts w:ascii="Aptos" w:hAnsi="Aptos"/>
-                <w:b/>
-                <w:i w:val="0"/>
-                <w:color w:val="2E74B5"/>
-                <w:sz w:val="19"/>
-              </w:rPr>
-              <w:t xml:space="preserve">MAIN MESSAGE  </w:t>
-            </w:r>
-            <w:r>
-              <w:rPr>
-                <w:rFonts w:ascii="Aptos" w:hAnsi="Aptos"/>
                 <w:b w:val="0"/>
                 <w:i w:val="0"/>
                 <w:color w:val="0B2545"/>
@@ -232,16 +222,6 @@
             <w:pPr>
               <w:spacing w:after="0"/>
             </w:pPr>
-            <w:r>
-              <w:rPr>
-                <w:rFonts w:ascii="Aptos" w:hAnsi="Aptos"/>
-                <w:b/>
-                <w:i w:val="0"/>
-                <w:color w:val="2E74B5"/>
-                <w:sz w:val="19"/>
-              </w:rPr>
-              <w:t xml:space="preserve">MAIN MESSAGE  </w:t>
-            </w:r>
             <w:r>
               <w:rPr>
                 <w:rFonts w:ascii="Aptos" w:hAnsi="Aptos"/>
@@ -343,16 +323,6 @@
             <w:r>
               <w:rPr>
                 <w:rFonts w:ascii="Aptos" w:hAnsi="Aptos"/>
-                <w:b/>
-                <w:i w:val="0"/>
-                <w:color w:val="2E74B5"/>
-                <w:sz w:val="19"/>
-              </w:rPr>
-              <w:t xml:space="preserve">MAIN MESSAGE  </w:t>
-            </w:r>
-            <w:r>
-              <w:rPr>
-                <w:rFonts w:ascii="Aptos" w:hAnsi="Aptos"/>
                 <w:b w:val="0"/>
                 <w:i w:val="0"/>
                 <w:color w:val="0B2545"/>
@@ -448,16 +418,6 @@
             <w:pPr>
               <w:spacing w:after="0"/>
             </w:pPr>
-            <w:r>
-              <w:rPr>
-                <w:rFonts w:ascii="Aptos" w:hAnsi="Aptos"/>
-                <w:b/>
-                <w:i w:val="0"/>
-                <w:color w:val="2E74B5"/>
-                <w:sz w:val="19"/>
-              </w:rPr>
-              <w:t xml:space="preserve">MAIN MESSAGE  </w:t>
-            </w:r>
             <w:r>
               <w:rPr>
                 <w:rFonts w:ascii="Aptos" w:hAnsi="Aptos"/>
@@ -667,16 +627,6 @@
             <w:r>
               <w:rPr>
                 <w:rFonts w:ascii="Aptos" w:hAnsi="Aptos"/>
-                <w:b/>
-                <w:i w:val="0"/>
-                <w:color w:val="2E74B5"/>
-                <w:sz w:val="19"/>
-              </w:rPr>
-              <w:t xml:space="preserve">MAIN MESSAGE  </w:t>
-            </w:r>
-            <w:r>
-              <w:rPr>
-                <w:rFonts w:ascii="Aptos" w:hAnsi="Aptos"/>
                 <w:b w:val="0"/>
                 <w:i w:val="0"/>
                 <w:color w:val="0B2545"/>
@@ -701,7 +651,7 @@
       <w:r>
         <w:drawing>
           <wp:inline xmlns:a="http://schemas.openxmlformats.org/drawingml/2006/main" xmlns:pic="http://schemas.openxmlformats.org/drawingml/2006/picture">
-            <wp:extent cx="8043116" cy="5102352"/>
+            <wp:extent cx="6251170" cy="4297679"/>
             <wp:docPr id="7" name="Picture 7" descr="Data Mover screenshot: 5. Connections" title="5. Connections"/>
             <wp:cNvGraphicFramePr>
               <a:graphicFrameLocks noChangeAspect="1"/>
@@ -710,7 +660,7 @@
               <a:graphicData uri="http://schemas.openxmlformats.org/drawingml/2006/picture">
                 <pic:pic>
                   <pic:nvPicPr>
-                    <pic:cNvPr id="0" name="05-connections-01.jpg"/>
+                    <pic:cNvPr id="0" name="05-connections-full-screen.jpg"/>
                     <pic:cNvPicPr/>
                   </pic:nvPicPr>
                   <pic:blipFill>
@@ -722,61 +672,7 @@
                   <pic:spPr>
                     <a:xfrm>
                       <a:off x="0" y="0"/>
-                      <a:ext cx="8043116" cy="5102352"/>
-                    </a:xfrm>
-                    <a:prstGeom prst="rect"/>
-                  </pic:spPr>
-                </pic:pic>
-              </a:graphicData>
-            </a:graphic>
-          </wp:inline>
-        </w:drawing>
-      </w:r>
-    </w:p>
-    <w:p>
-      <w:r>
-        <w:br w:type="page"/>
-      </w:r>
-    </w:p>
-    <w:p>
-      <w:pPr>
-        <w:pStyle w:val="Heading2"/>
-        <w:keepNext/>
-      </w:pPr>
-      <w:r>
-        <w:t>5. Connections — continued</w:t>
-      </w:r>
-    </w:p>
-    <w:p>
-      <w:pPr>
-        <w:spacing w:before="0" w:after="0"/>
-        <w:jc w:val="center"/>
-      </w:pPr>
-      <w:r>
-        <w:drawing>
-          <wp:inline xmlns:a="http://schemas.openxmlformats.org/drawingml/2006/main" xmlns:pic="http://schemas.openxmlformats.org/drawingml/2006/picture">
-            <wp:extent cx="8641080" cy="5481685"/>
-            <wp:docPr id="8" name="Picture 8" descr="Data Mover screenshot: 5. Connections, continued panel 2" title="5. Connections, continued panel 2"/>
-            <wp:cNvGraphicFramePr>
-              <a:graphicFrameLocks noChangeAspect="1"/>
-            </wp:cNvGraphicFramePr>
-            <a:graphic>
-              <a:graphicData uri="http://schemas.openxmlformats.org/drawingml/2006/picture">
-                <pic:pic>
-                  <pic:nvPicPr>
-                    <pic:cNvPr id="0" name="05-connections-02.jpg"/>
-                    <pic:cNvPicPr/>
-                  </pic:nvPicPr>
-                  <pic:blipFill>
-                    <a:blip r:embed="rId18"/>
-                    <a:stretch>
-                      <a:fillRect/>
-                    </a:stretch>
-                  </pic:blipFill>
-                  <pic:spPr>
-                    <a:xfrm>
-                      <a:off x="0" y="0"/>
-                      <a:ext cx="8641080" cy="5481685"/>
+                      <a:ext cx="6251170" cy="4297679"/>
                     </a:xfrm>
                     <a:prstGeom prst="rect"/>
                   </pic:spPr>
@@ -829,16 +725,6 @@
             <w:r>
               <w:rPr>
                 <w:rFonts w:ascii="Aptos" w:hAnsi="Aptos"/>
-                <w:b/>
-                <w:i w:val="0"/>
-                <w:color w:val="2E74B5"/>
-                <w:sz w:val="19"/>
-              </w:rPr>
-              <w:t xml:space="preserve">MAIN MESSAGE  </w:t>
-            </w:r>
-            <w:r>
-              <w:rPr>
-                <w:rFonts w:ascii="Aptos" w:hAnsi="Aptos"/>
                 <w:b w:val="0"/>
                 <w:i w:val="0"/>
                 <w:color w:val="0B2545"/>
@@ -864,7 +750,7 @@
         <w:drawing>
           <wp:inline xmlns:a="http://schemas.openxmlformats.org/drawingml/2006/main" xmlns:pic="http://schemas.openxmlformats.org/drawingml/2006/picture">
             <wp:extent cx="8641080" cy="3962745"/>
-            <wp:docPr id="9" name="Picture 9" descr="Data Mover screenshot: 6. Account settings" title="6. Account settings"/>
+            <wp:docPr id="8" name="Picture 8" descr="Data Mover screenshot: 6. Account settings" title="6. Account settings"/>
             <wp:cNvGraphicFramePr>
               <a:graphicFrameLocks noChangeAspect="1"/>
             </wp:cNvGraphicFramePr>
@@ -876,7 +762,7 @@
                     <pic:cNvPicPr/>
                   </pic:nvPicPr>
                   <pic:blipFill>
-                    <a:blip r:embed="rId19"/>
+                    <a:blip r:embed="rId18"/>
                     <a:stretch>
                       <a:fillRect/>
                     </a:stretch>
@@ -918,7 +804,7 @@
         <w:drawing>
           <wp:inline xmlns:a="http://schemas.openxmlformats.org/drawingml/2006/main" xmlns:pic="http://schemas.openxmlformats.org/drawingml/2006/picture">
             <wp:extent cx="8641080" cy="3955994"/>
-            <wp:docPr id="10" name="Picture 10" descr="Data Mover screenshot: 6. Account settings, continued panel 2" title="6. Account settings, continued panel 2"/>
+            <wp:docPr id="9" name="Picture 9" descr="Data Mover screenshot: 6. Account settings, continued panel 2" title="6. Account settings, continued panel 2"/>
             <wp:cNvGraphicFramePr>
               <a:graphicFrameLocks noChangeAspect="1"/>
             </wp:cNvGraphicFramePr>
@@ -930,7 +816,7 @@
                     <pic:cNvPicPr/>
                   </pic:nvPicPr>
                   <pic:blipFill>
-                    <a:blip r:embed="rId20"/>
+                    <a:blip r:embed="rId19"/>
                     <a:stretch>
                       <a:fillRect/>
                     </a:stretch>
@@ -991,16 +877,6 @@
             <w:r>
               <w:rPr>
                 <w:rFonts w:ascii="Aptos" w:hAnsi="Aptos"/>
-                <w:b/>
-                <w:i w:val="0"/>
-                <w:color w:val="2E74B5"/>
-                <w:sz w:val="19"/>
-              </w:rPr>
-              <w:t xml:space="preserve">MAIN MESSAGE  </w:t>
-            </w:r>
-            <w:r>
-              <w:rPr>
-                <w:rFonts w:ascii="Aptos" w:hAnsi="Aptos"/>
                 <w:b w:val="0"/>
                 <w:i w:val="0"/>
                 <w:color w:val="0B2545"/>
@@ -1026,7 +902,7 @@
         <w:drawing>
           <wp:inline xmlns:a="http://schemas.openxmlformats.org/drawingml/2006/main" xmlns:pic="http://schemas.openxmlformats.org/drawingml/2006/picture">
             <wp:extent cx="7161195" cy="5102351"/>
-            <wp:docPr id="11" name="Picture 11" descr="Data Mover screenshot: 7. Users and invitations" title="7. Users and invitations"/>
+            <wp:docPr id="10" name="Picture 10" descr="Data Mover screenshot: 7. Users and invitations" title="7. Users and invitations"/>
             <wp:cNvGraphicFramePr>
               <a:graphicFrameLocks noChangeAspect="1"/>
             </wp:cNvGraphicFramePr>
@@ -1038,7 +914,7 @@
                     <pic:cNvPicPr/>
                   </pic:nvPicPr>
                   <pic:blipFill>
-                    <a:blip r:embed="rId21"/>
+                    <a:blip r:embed="rId20"/>
                     <a:stretch>
                       <a:fillRect/>
                     </a:stretch>
@@ -1099,16 +975,6 @@
             <w:r>
               <w:rPr>
                 <w:rFonts w:ascii="Aptos" w:hAnsi="Aptos"/>
-                <w:b/>
-                <w:i w:val="0"/>
-                <w:color w:val="2E74B5"/>
-                <w:sz w:val="19"/>
-              </w:rPr>
-              <w:t xml:space="preserve">MAIN MESSAGE  </w:t>
-            </w:r>
-            <w:r>
-              <w:rPr>
-                <w:rFonts w:ascii="Aptos" w:hAnsi="Aptos"/>
                 <w:b w:val="0"/>
                 <w:i w:val="0"/>
                 <w:color w:val="0B2545"/>
@@ -1134,7 +1000,7 @@
         <w:drawing>
           <wp:inline xmlns:a="http://schemas.openxmlformats.org/drawingml/2006/main" xmlns:pic="http://schemas.openxmlformats.org/drawingml/2006/picture">
             <wp:extent cx="8641080" cy="3787223"/>
-            <wp:docPr id="12" name="Picture 12" descr="Data Mover screenshot: 8. Audit activity" title="8. Audit activity"/>
+            <wp:docPr id="11" name="Picture 11" descr="Data Mover screenshot: 8. Audit activity" title="8. Audit activity"/>
             <wp:cNvGraphicFramePr>
               <a:graphicFrameLocks noChangeAspect="1"/>
             </wp:cNvGraphicFramePr>
@@ -1146,7 +1012,7 @@
                     <pic:cNvPicPr/>
                   </pic:nvPicPr>
                   <pic:blipFill>
-                    <a:blip r:embed="rId22"/>
+                    <a:blip r:embed="rId21"/>
                     <a:stretch>
                       <a:fillRect/>
                     </a:stretch>
@@ -1188,7 +1054,7 @@
         <w:drawing>
           <wp:inline xmlns:a="http://schemas.openxmlformats.org/drawingml/2006/main" xmlns:pic="http://schemas.openxmlformats.org/drawingml/2006/picture">
             <wp:extent cx="8641080" cy="3787223"/>
-            <wp:docPr id="13" name="Picture 13" descr="Data Mover screenshot: 8. Audit activity, continued panel 2" title="8. Audit activity, continued panel 2"/>
+            <wp:docPr id="12" name="Picture 12" descr="Data Mover screenshot: 8. Audit activity, continued panel 2" title="8. Audit activity, continued panel 2"/>
             <wp:cNvGraphicFramePr>
               <a:graphicFrameLocks noChangeAspect="1"/>
             </wp:cNvGraphicFramePr>
@@ -1200,7 +1066,7 @@
                     <pic:cNvPicPr/>
                   </pic:nvPicPr>
                   <pic:blipFill>
-                    <a:blip r:embed="rId23"/>
+                    <a:blip r:embed="rId22"/>
                     <a:stretch>
                       <a:fillRect/>
                     </a:stretch>

</xml_diff>

<commit_message>
Use one full-screen viewport per screenshot section.
Rebuild the demo guide so each page is a single desktop capture, with a wider Connections image for the two-column layout.
</commit_message>
<xml_diff>
--- a/artifacts/Data_Mover_Demo_Screenshots_v1.docx
+++ b/artifacts/Data_Mover_Demo_Screenshots_v1.docx
@@ -67,7 +67,7 @@
           <w:color w:val="0B2545"/>
           <w:sz w:val="22"/>
         </w:rPr>
-        <w:t>This guide captures the principal Data Mover screens and states the single idea each screen should communicate. Long pages continue across panels so interface text remains readable.</w:t>
+        <w:t>This guide captures the principal Data Mover screens and states the single idea each screen should communicate. Each image presents one complete desktop viewport at a consistent scale.</w:t>
       </w:r>
     </w:p>
     <w:p>
@@ -151,7 +151,7 @@
       <w:r>
         <w:drawing>
           <wp:inline xmlns:a="http://schemas.openxmlformats.org/drawingml/2006/main" xmlns:pic="http://schemas.openxmlformats.org/drawingml/2006/picture">
-            <wp:extent cx="7421602" cy="5102351"/>
+            <wp:extent cx="6849687" cy="4709160"/>
             <wp:docPr id="1" name="Picture 1" descr="Data Mover screenshot: 1. Sign in" title="1. Sign in"/>
             <wp:cNvGraphicFramePr>
               <a:graphicFrameLocks noChangeAspect="1"/>
@@ -160,7 +160,7 @@
               <a:graphicData uri="http://schemas.openxmlformats.org/drawingml/2006/picture">
                 <pic:pic>
                   <pic:nvPicPr>
-                    <pic:cNvPr id="0" name="01-sign-in-01.jpg"/>
+                    <pic:cNvPr id="0" name="01-sign-in-full-screen.jpg"/>
                     <pic:cNvPicPr/>
                   </pic:nvPicPr>
                   <pic:blipFill>
@@ -172,7 +172,7 @@
                   <pic:spPr>
                     <a:xfrm>
                       <a:off x="0" y="0"/>
-                      <a:ext cx="7421602" cy="5102351"/>
+                      <a:ext cx="6849687" cy="4709160"/>
                     </a:xfrm>
                     <a:prstGeom prst="rect"/>
                   </pic:spPr>
@@ -249,7 +249,7 @@
       <w:r>
         <w:drawing>
           <wp:inline xmlns:a="http://schemas.openxmlformats.org/drawingml/2006/main" xmlns:pic="http://schemas.openxmlformats.org/drawingml/2006/picture">
-            <wp:extent cx="7620782" cy="5102352"/>
+            <wp:extent cx="7033517" cy="4709159"/>
             <wp:docPr id="2" name="Picture 2" descr="Data Mover screenshot: 2. Request access" title="2. Request access"/>
             <wp:cNvGraphicFramePr>
               <a:graphicFrameLocks noChangeAspect="1"/>
@@ -258,7 +258,7 @@
               <a:graphicData uri="http://schemas.openxmlformats.org/drawingml/2006/picture">
                 <pic:pic>
                   <pic:nvPicPr>
-                    <pic:cNvPr id="0" name="02-request-access-01.jpg"/>
+                    <pic:cNvPr id="0" name="02-request-access-full-screen.jpg"/>
                     <pic:cNvPicPr/>
                   </pic:nvPicPr>
                   <pic:blipFill>
@@ -270,7 +270,7 @@
                   <pic:spPr>
                     <a:xfrm>
                       <a:off x="0" y="0"/>
-                      <a:ext cx="7620782" cy="5102352"/>
+                      <a:ext cx="7033517" cy="4709159"/>
                     </a:xfrm>
                     <a:prstGeom prst="rect"/>
                   </pic:spPr>
@@ -347,7 +347,7 @@
       <w:r>
         <w:drawing>
           <wp:inline xmlns:a="http://schemas.openxmlformats.org/drawingml/2006/main" xmlns:pic="http://schemas.openxmlformats.org/drawingml/2006/picture">
-            <wp:extent cx="7620782" cy="5102352"/>
+            <wp:extent cx="7033517" cy="4709159"/>
             <wp:docPr id="3" name="Picture 3" descr="Data Mover screenshot: 3. Password recovery" title="3. Password recovery"/>
             <wp:cNvGraphicFramePr>
               <a:graphicFrameLocks noChangeAspect="1"/>
@@ -356,7 +356,7 @@
               <a:graphicData uri="http://schemas.openxmlformats.org/drawingml/2006/picture">
                 <pic:pic>
                   <pic:nvPicPr>
-                    <pic:cNvPr id="0" name="03-password-recovery-01.jpg"/>
+                    <pic:cNvPr id="0" name="03-password-recovery-full-screen.jpg"/>
                     <pic:cNvPicPr/>
                   </pic:nvPicPr>
                   <pic:blipFill>
@@ -368,7 +368,7 @@
                   <pic:spPr>
                     <a:xfrm>
                       <a:off x="0" y="0"/>
-                      <a:ext cx="7620782" cy="5102352"/>
+                      <a:ext cx="7033517" cy="4709159"/>
                     </a:xfrm>
                     <a:prstGeom prst="rect"/>
                   </pic:spPr>
@@ -445,7 +445,7 @@
       <w:r>
         <w:drawing>
           <wp:inline xmlns:a="http://schemas.openxmlformats.org/drawingml/2006/main" xmlns:pic="http://schemas.openxmlformats.org/drawingml/2006/picture">
-            <wp:extent cx="8641080" cy="4617577"/>
+            <wp:extent cx="6849687" cy="4709160"/>
             <wp:docPr id="4" name="Picture 4" descr="Data Mover screenshot: 4. Pipeline builder" title="4. Pipeline builder"/>
             <wp:cNvGraphicFramePr>
               <a:graphicFrameLocks noChangeAspect="1"/>
@@ -454,7 +454,7 @@
               <a:graphicData uri="http://schemas.openxmlformats.org/drawingml/2006/picture">
                 <pic:pic>
                   <pic:nvPicPr>
-                    <pic:cNvPr id="0" name="04-pipeline-builder-01.jpg"/>
+                    <pic:cNvPr id="0" name="04-pipeline-builder-full-screen.jpg"/>
                     <pic:cNvPicPr/>
                   </pic:nvPicPr>
                   <pic:blipFill>
@@ -466,115 +466,7 @@
                   <pic:spPr>
                     <a:xfrm>
                       <a:off x="0" y="0"/>
-                      <a:ext cx="8641080" cy="4617577"/>
-                    </a:xfrm>
-                    <a:prstGeom prst="rect"/>
-                  </pic:spPr>
-                </pic:pic>
-              </a:graphicData>
-            </a:graphic>
-          </wp:inline>
-        </w:drawing>
-      </w:r>
-    </w:p>
-    <w:p>
-      <w:r>
-        <w:br w:type="page"/>
-      </w:r>
-    </w:p>
-    <w:p>
-      <w:pPr>
-        <w:pStyle w:val="Heading2"/>
-        <w:keepNext/>
-      </w:pPr>
-      <w:r>
-        <w:t>4. Pipeline builder — continued</w:t>
-      </w:r>
-    </w:p>
-    <w:p>
-      <w:pPr>
-        <w:spacing w:before="0" w:after="0"/>
-        <w:jc w:val="center"/>
-      </w:pPr>
-      <w:r>
-        <w:drawing>
-          <wp:inline xmlns:a="http://schemas.openxmlformats.org/drawingml/2006/main" xmlns:pic="http://schemas.openxmlformats.org/drawingml/2006/picture">
-            <wp:extent cx="8641080" cy="4617577"/>
-            <wp:docPr id="5" name="Picture 5" descr="Data Mover screenshot: 4. Pipeline builder, continued panel 2" title="4. Pipeline builder, continued panel 2"/>
-            <wp:cNvGraphicFramePr>
-              <a:graphicFrameLocks noChangeAspect="1"/>
-            </wp:cNvGraphicFramePr>
-            <a:graphic>
-              <a:graphicData uri="http://schemas.openxmlformats.org/drawingml/2006/picture">
-                <pic:pic>
-                  <pic:nvPicPr>
-                    <pic:cNvPr id="0" name="04-pipeline-builder-02.jpg"/>
-                    <pic:cNvPicPr/>
-                  </pic:nvPicPr>
-                  <pic:blipFill>
-                    <a:blip r:embed="rId15"/>
-                    <a:stretch>
-                      <a:fillRect/>
-                    </a:stretch>
-                  </pic:blipFill>
-                  <pic:spPr>
-                    <a:xfrm>
-                      <a:off x="0" y="0"/>
-                      <a:ext cx="8641080" cy="4617577"/>
-                    </a:xfrm>
-                    <a:prstGeom prst="rect"/>
-                  </pic:spPr>
-                </pic:pic>
-              </a:graphicData>
-            </a:graphic>
-          </wp:inline>
-        </w:drawing>
-      </w:r>
-    </w:p>
-    <w:p>
-      <w:r>
-        <w:br w:type="page"/>
-      </w:r>
-    </w:p>
-    <w:p>
-      <w:pPr>
-        <w:pStyle w:val="Heading2"/>
-        <w:keepNext/>
-      </w:pPr>
-      <w:r>
-        <w:t>4. Pipeline builder — continued</w:t>
-      </w:r>
-    </w:p>
-    <w:p>
-      <w:pPr>
-        <w:spacing w:before="0" w:after="0"/>
-        <w:jc w:val="center"/>
-      </w:pPr>
-      <w:r>
-        <w:drawing>
-          <wp:inline xmlns:a="http://schemas.openxmlformats.org/drawingml/2006/main" xmlns:pic="http://schemas.openxmlformats.org/drawingml/2006/picture">
-            <wp:extent cx="8641080" cy="4617577"/>
-            <wp:docPr id="6" name="Picture 6" descr="Data Mover screenshot: 4. Pipeline builder, continued panel 3" title="4. Pipeline builder, continued panel 3"/>
-            <wp:cNvGraphicFramePr>
-              <a:graphicFrameLocks noChangeAspect="1"/>
-            </wp:cNvGraphicFramePr>
-            <a:graphic>
-              <a:graphicData uri="http://schemas.openxmlformats.org/drawingml/2006/picture">
-                <pic:pic>
-                  <pic:nvPicPr>
-                    <pic:cNvPr id="0" name="04-pipeline-builder-03.jpg"/>
-                    <pic:cNvPicPr/>
-                  </pic:nvPicPr>
-                  <pic:blipFill>
-                    <a:blip r:embed="rId16"/>
-                    <a:stretch>
-                      <a:fillRect/>
-                    </a:stretch>
-                  </pic:blipFill>
-                  <pic:spPr>
-                    <a:xfrm>
-                      <a:off x="0" y="0"/>
-                      <a:ext cx="8641080" cy="4617577"/>
+                      <a:ext cx="6849687" cy="4709160"/>
                     </a:xfrm>
                     <a:prstGeom prst="rect"/>
                   </pic:spPr>
@@ -651,8 +543,8 @@
       <w:r>
         <w:drawing>
           <wp:inline xmlns:a="http://schemas.openxmlformats.org/drawingml/2006/main" xmlns:pic="http://schemas.openxmlformats.org/drawingml/2006/picture">
-            <wp:extent cx="6251170" cy="4297679"/>
-            <wp:docPr id="7" name="Picture 7" descr="Data Mover screenshot: 5. Connections" title="5. Connections"/>
+            <wp:extent cx="7534656" cy="4709160"/>
+            <wp:docPr id="5" name="Picture 5" descr="Data Mover screenshot: 5. Connections" title="5. Connections"/>
             <wp:cNvGraphicFramePr>
               <a:graphicFrameLocks noChangeAspect="1"/>
             </wp:cNvGraphicFramePr>
@@ -664,7 +556,7 @@
                     <pic:cNvPicPr/>
                   </pic:nvPicPr>
                   <pic:blipFill>
-                    <a:blip r:embed="rId17"/>
+                    <a:blip r:embed="rId15"/>
                     <a:stretch>
                       <a:fillRect/>
                     </a:stretch>
@@ -672,7 +564,7 @@
                   <pic:spPr>
                     <a:xfrm>
                       <a:off x="0" y="0"/>
-                      <a:ext cx="6251170" cy="4297679"/>
+                      <a:ext cx="7534656" cy="4709160"/>
                     </a:xfrm>
                     <a:prstGeom prst="rect"/>
                   </pic:spPr>
@@ -749,8 +641,8 @@
       <w:r>
         <w:drawing>
           <wp:inline xmlns:a="http://schemas.openxmlformats.org/drawingml/2006/main" xmlns:pic="http://schemas.openxmlformats.org/drawingml/2006/picture">
-            <wp:extent cx="8641080" cy="3962745"/>
-            <wp:docPr id="8" name="Picture 8" descr="Data Mover screenshot: 6. Account settings" title="6. Account settings"/>
+            <wp:extent cx="6849687" cy="4709160"/>
+            <wp:docPr id="6" name="Picture 6" descr="Data Mover screenshot: 6. Account settings" title="6. Account settings"/>
             <wp:cNvGraphicFramePr>
               <a:graphicFrameLocks noChangeAspect="1"/>
             </wp:cNvGraphicFramePr>
@@ -758,11 +650,11 @@
               <a:graphicData uri="http://schemas.openxmlformats.org/drawingml/2006/picture">
                 <pic:pic>
                   <pic:nvPicPr>
-                    <pic:cNvPr id="0" name="06-account-settings-01.jpg"/>
+                    <pic:cNvPr id="0" name="06-account-settings-full-screen.jpg"/>
                     <pic:cNvPicPr/>
                   </pic:nvPicPr>
                   <pic:blipFill>
-                    <a:blip r:embed="rId18"/>
+                    <a:blip r:embed="rId16"/>
                     <a:stretch>
                       <a:fillRect/>
                     </a:stretch>
@@ -770,61 +662,7 @@
                   <pic:spPr>
                     <a:xfrm>
                       <a:off x="0" y="0"/>
-                      <a:ext cx="8641080" cy="3962745"/>
-                    </a:xfrm>
-                    <a:prstGeom prst="rect"/>
-                  </pic:spPr>
-                </pic:pic>
-              </a:graphicData>
-            </a:graphic>
-          </wp:inline>
-        </w:drawing>
-      </w:r>
-    </w:p>
-    <w:p>
-      <w:r>
-        <w:br w:type="page"/>
-      </w:r>
-    </w:p>
-    <w:p>
-      <w:pPr>
-        <w:pStyle w:val="Heading2"/>
-        <w:keepNext/>
-      </w:pPr>
-      <w:r>
-        <w:t>6. Account settings — continued</w:t>
-      </w:r>
-    </w:p>
-    <w:p>
-      <w:pPr>
-        <w:spacing w:before="0" w:after="0"/>
-        <w:jc w:val="center"/>
-      </w:pPr>
-      <w:r>
-        <w:drawing>
-          <wp:inline xmlns:a="http://schemas.openxmlformats.org/drawingml/2006/main" xmlns:pic="http://schemas.openxmlformats.org/drawingml/2006/picture">
-            <wp:extent cx="8641080" cy="3955994"/>
-            <wp:docPr id="9" name="Picture 9" descr="Data Mover screenshot: 6. Account settings, continued panel 2" title="6. Account settings, continued panel 2"/>
-            <wp:cNvGraphicFramePr>
-              <a:graphicFrameLocks noChangeAspect="1"/>
-            </wp:cNvGraphicFramePr>
-            <a:graphic>
-              <a:graphicData uri="http://schemas.openxmlformats.org/drawingml/2006/picture">
-                <pic:pic>
-                  <pic:nvPicPr>
-                    <pic:cNvPr id="0" name="06-account-settings-02.jpg"/>
-                    <pic:cNvPicPr/>
-                  </pic:nvPicPr>
-                  <pic:blipFill>
-                    <a:blip r:embed="rId19"/>
-                    <a:stretch>
-                      <a:fillRect/>
-                    </a:stretch>
-                  </pic:blipFill>
-                  <pic:spPr>
-                    <a:xfrm>
-                      <a:off x="0" y="0"/>
-                      <a:ext cx="8641080" cy="3955994"/>
+                      <a:ext cx="6849687" cy="4709160"/>
                     </a:xfrm>
                     <a:prstGeom prst="rect"/>
                   </pic:spPr>
@@ -901,8 +739,8 @@
       <w:r>
         <w:drawing>
           <wp:inline xmlns:a="http://schemas.openxmlformats.org/drawingml/2006/main" xmlns:pic="http://schemas.openxmlformats.org/drawingml/2006/picture">
-            <wp:extent cx="7161195" cy="5102351"/>
-            <wp:docPr id="10" name="Picture 10" descr="Data Mover screenshot: 7. Users and invitations" title="7. Users and invitations"/>
+            <wp:extent cx="6849687" cy="4709160"/>
+            <wp:docPr id="7" name="Picture 7" descr="Data Mover screenshot: 7. Users and invitations" title="7. Users and invitations"/>
             <wp:cNvGraphicFramePr>
               <a:graphicFrameLocks noChangeAspect="1"/>
             </wp:cNvGraphicFramePr>
@@ -910,11 +748,11 @@
               <a:graphicData uri="http://schemas.openxmlformats.org/drawingml/2006/picture">
                 <pic:pic>
                   <pic:nvPicPr>
-                    <pic:cNvPr id="0" name="07-user-administration-01.jpg"/>
+                    <pic:cNvPr id="0" name="07-user-administration-full-screen.jpg"/>
                     <pic:cNvPicPr/>
                   </pic:nvPicPr>
                   <pic:blipFill>
-                    <a:blip r:embed="rId20"/>
+                    <a:blip r:embed="rId17"/>
                     <a:stretch>
                       <a:fillRect/>
                     </a:stretch>
@@ -922,7 +760,7 @@
                   <pic:spPr>
                     <a:xfrm>
                       <a:off x="0" y="0"/>
-                      <a:ext cx="7161195" cy="5102351"/>
+                      <a:ext cx="6849687" cy="4709160"/>
                     </a:xfrm>
                     <a:prstGeom prst="rect"/>
                   </pic:spPr>
@@ -999,8 +837,8 @@
       <w:r>
         <w:drawing>
           <wp:inline xmlns:a="http://schemas.openxmlformats.org/drawingml/2006/main" xmlns:pic="http://schemas.openxmlformats.org/drawingml/2006/picture">
-            <wp:extent cx="8641080" cy="3787223"/>
-            <wp:docPr id="11" name="Picture 11" descr="Data Mover screenshot: 8. Audit activity" title="8. Audit activity"/>
+            <wp:extent cx="6849687" cy="4709160"/>
+            <wp:docPr id="8" name="Picture 8" descr="Data Mover screenshot: 8. Audit activity" title="8. Audit activity"/>
             <wp:cNvGraphicFramePr>
               <a:graphicFrameLocks noChangeAspect="1"/>
             </wp:cNvGraphicFramePr>
@@ -1008,11 +846,11 @@
               <a:graphicData uri="http://schemas.openxmlformats.org/drawingml/2006/picture">
                 <pic:pic>
                   <pic:nvPicPr>
-                    <pic:cNvPr id="0" name="08-audit-history-01.jpg"/>
+                    <pic:cNvPr id="0" name="08-audit-history-full-screen.jpg"/>
                     <pic:cNvPicPr/>
                   </pic:nvPicPr>
                   <pic:blipFill>
-                    <a:blip r:embed="rId21"/>
+                    <a:blip r:embed="rId18"/>
                     <a:stretch>
                       <a:fillRect/>
                     </a:stretch>
@@ -1020,61 +858,7 @@
                   <pic:spPr>
                     <a:xfrm>
                       <a:off x="0" y="0"/>
-                      <a:ext cx="8641080" cy="3787223"/>
-                    </a:xfrm>
-                    <a:prstGeom prst="rect"/>
-                  </pic:spPr>
-                </pic:pic>
-              </a:graphicData>
-            </a:graphic>
-          </wp:inline>
-        </w:drawing>
-      </w:r>
-    </w:p>
-    <w:p>
-      <w:r>
-        <w:br w:type="page"/>
-      </w:r>
-    </w:p>
-    <w:p>
-      <w:pPr>
-        <w:pStyle w:val="Heading2"/>
-        <w:keepNext/>
-      </w:pPr>
-      <w:r>
-        <w:t>8. Audit activity — continued</w:t>
-      </w:r>
-    </w:p>
-    <w:p>
-      <w:pPr>
-        <w:spacing w:before="0" w:after="0"/>
-        <w:jc w:val="center"/>
-      </w:pPr>
-      <w:r>
-        <w:drawing>
-          <wp:inline xmlns:a="http://schemas.openxmlformats.org/drawingml/2006/main" xmlns:pic="http://schemas.openxmlformats.org/drawingml/2006/picture">
-            <wp:extent cx="8641080" cy="3787223"/>
-            <wp:docPr id="12" name="Picture 12" descr="Data Mover screenshot: 8. Audit activity, continued panel 2" title="8. Audit activity, continued panel 2"/>
-            <wp:cNvGraphicFramePr>
-              <a:graphicFrameLocks noChangeAspect="1"/>
-            </wp:cNvGraphicFramePr>
-            <a:graphic>
-              <a:graphicData uri="http://schemas.openxmlformats.org/drawingml/2006/picture">
-                <pic:pic>
-                  <pic:nvPicPr>
-                    <pic:cNvPr id="0" name="08-audit-history-02.jpg"/>
-                    <pic:cNvPicPr/>
-                  </pic:nvPicPr>
-                  <pic:blipFill>
-                    <a:blip r:embed="rId22"/>
-                    <a:stretch>
-                      <a:fillRect/>
-                    </a:stretch>
-                  </pic:blipFill>
-                  <pic:spPr>
-                    <a:xfrm>
-                      <a:off x="0" y="0"/>
-                      <a:ext cx="8641080" cy="3787223"/>
+                      <a:ext cx="6849687" cy="4709160"/>
                     </a:xfrm>
                     <a:prstGeom prst="rect"/>
                   </pic:spPr>

</xml_diff>

<commit_message>
Keep screenshot viewports as PNG to avoid JPEG softening.
Rebuild the demo Word doc from lossless working images and tell Word not to downsample the embedded captures.
</commit_message>
<xml_diff>
--- a/artifacts/Data_Mover_Demo_Screenshots_v1.docx
+++ b/artifacts/Data_Mover_Demo_Screenshots_v1.docx
@@ -160,7 +160,7 @@
               <a:graphicData uri="http://schemas.openxmlformats.org/drawingml/2006/picture">
                 <pic:pic>
                   <pic:nvPicPr>
-                    <pic:cNvPr id="0" name="01-sign-in-full-screen.jpg"/>
+                    <pic:cNvPr id="0" name="01-sign-in-full-screen.png"/>
                     <pic:cNvPicPr/>
                   </pic:nvPicPr>
                   <pic:blipFill>
@@ -258,7 +258,7 @@
               <a:graphicData uri="http://schemas.openxmlformats.org/drawingml/2006/picture">
                 <pic:pic>
                   <pic:nvPicPr>
-                    <pic:cNvPr id="0" name="02-request-access-full-screen.jpg"/>
+                    <pic:cNvPr id="0" name="02-request-access-full-screen.png"/>
                     <pic:cNvPicPr/>
                   </pic:nvPicPr>
                   <pic:blipFill>
@@ -356,7 +356,7 @@
               <a:graphicData uri="http://schemas.openxmlformats.org/drawingml/2006/picture">
                 <pic:pic>
                   <pic:nvPicPr>
-                    <pic:cNvPr id="0" name="03-password-recovery-full-screen.jpg"/>
+                    <pic:cNvPr id="0" name="03-password-recovery-full-screen.png"/>
                     <pic:cNvPicPr/>
                   </pic:nvPicPr>
                   <pic:blipFill>
@@ -454,7 +454,7 @@
               <a:graphicData uri="http://schemas.openxmlformats.org/drawingml/2006/picture">
                 <pic:pic>
                   <pic:nvPicPr>
-                    <pic:cNvPr id="0" name="04-pipeline-builder-full-screen.jpg"/>
+                    <pic:cNvPr id="0" name="04-pipeline-builder-full-screen.png"/>
                     <pic:cNvPicPr/>
                   </pic:nvPicPr>
                   <pic:blipFill>
@@ -552,7 +552,7 @@
               <a:graphicData uri="http://schemas.openxmlformats.org/drawingml/2006/picture">
                 <pic:pic>
                   <pic:nvPicPr>
-                    <pic:cNvPr id="0" name="05-connections-full-screen.jpg"/>
+                    <pic:cNvPr id="0" name="05-connections-full-screen.png"/>
                     <pic:cNvPicPr/>
                   </pic:nvPicPr>
                   <pic:blipFill>
@@ -650,7 +650,7 @@
               <a:graphicData uri="http://schemas.openxmlformats.org/drawingml/2006/picture">
                 <pic:pic>
                   <pic:nvPicPr>
-                    <pic:cNvPr id="0" name="06-account-settings-full-screen.jpg"/>
+                    <pic:cNvPr id="0" name="06-account-settings-full-screen.png"/>
                     <pic:cNvPicPr/>
                   </pic:nvPicPr>
                   <pic:blipFill>
@@ -748,7 +748,7 @@
               <a:graphicData uri="http://schemas.openxmlformats.org/drawingml/2006/picture">
                 <pic:pic>
                   <pic:nvPicPr>
-                    <pic:cNvPr id="0" name="07-user-administration-full-screen.jpg"/>
+                    <pic:cNvPr id="0" name="07-user-administration-full-screen.png"/>
                     <pic:cNvPicPr/>
                   </pic:nvPicPr>
                   <pic:blipFill>
@@ -846,7 +846,7 @@
               <a:graphicData uri="http://schemas.openxmlformats.org/drawingml/2006/picture">
                 <pic:pic>
                   <pic:nvPicPr>
-                    <pic:cNvPr id="0" name="08-audit-history-full-screen.jpg"/>
+                    <pic:cNvPr id="0" name="08-audit-history-full-screen.png"/>
                     <pic:cNvPicPr/>
                   </pic:nvPicPr>
                   <pic:blipFill>

</xml_diff>

<commit_message>
Refine Data Mover screenshot guide
</commit_message>
<xml_diff>
--- a/artifacts/Data_Mover_Demo_Screenshots_v1.docx
+++ b/artifacts/Data_Mover_Demo_Screenshots_v1.docx
@@ -445,7 +445,7 @@
       <w:r>
         <w:drawing>
           <wp:inline xmlns:a="http://schemas.openxmlformats.org/drawingml/2006/main" xmlns:pic="http://schemas.openxmlformats.org/drawingml/2006/picture">
-            <wp:extent cx="6849687" cy="4709160"/>
+            <wp:extent cx="5652654" cy="3886200"/>
             <wp:docPr id="4" name="Picture 4" descr="Data Mover screenshot: 4. Pipeline builder" title="4. Pipeline builder"/>
             <wp:cNvGraphicFramePr>
               <a:graphicFrameLocks noChangeAspect="1"/>
@@ -466,7 +466,7 @@
                   <pic:spPr>
                     <a:xfrm>
                       <a:off x="0" y="0"/>
-                      <a:ext cx="6849687" cy="4709160"/>
+                      <a:ext cx="5652654" cy="3886200"/>
                     </a:xfrm>
                     <a:prstGeom prst="rect"/>
                   </pic:spPr>
@@ -475,6 +475,25 @@
             </a:graphic>
           </wp:inline>
         </w:drawing>
+      </w:r>
+    </w:p>
+    <w:p>
+      <w:pPr>
+        <w:spacing w:before="100" w:after="0" w:line="252" w:lineRule="auto"/>
+      </w:pPr>
+      <w:r>
+        <w:rPr>
+          <w:rFonts w:ascii="Aptos" w:hAnsi="Aptos"/>
+          <w:b w:val="0"/>
+          <w:i w:val="0"/>
+          <w:color w:val="55606E"/>
+          <w:sz w:val="18"/>
+        </w:rPr>
+        <w:t>Sources currently mocked: CSV uploads, Advana (Databricks), MSS (Palantir Foundry), PostgreSQL (ADE), and MongoDB (ADE).</w:t>
+        <w:br/>
+        <w:t>Destinations currently mocked: Advana, MSS, PostgreSQL (ADE), and MongoDB (ADE).</w:t>
+        <w:br/>
+        <w:t>Planned implementation: replace synthetic catalogs, validation results, and transfer telemetry with live, secured connectors for these platforms, and add MCS as a supported connection.</w:t>
       </w:r>
     </w:p>
     <w:p>

</xml_diff>